<commit_message>
feat(partner-report): "Powered by DoThesis" partner report endpoint
Service-to-service report generation for Fillform (X-Partner-Token auth).

- POST /api/v1/partner/report (+ /progress): compose selected chapters from an
  uploaded analysis PDF/DOCX, return presigned PDF/DOCX + durable S3 keys
- Chapter subset = DoThesis M-steps; M2 bounded Crossref citations + References,
  M3 research-model diagram (mermaid → data URI)
- M1 topic inference so chapters aren't "[...]" stubs
- Markdown sanitizer: escape literal pipes in table cells (SmartPLS
  "T Statistics (|O/STDEV|)" no longer breaks tables), reflow inline * / - lists,
  demote hypotheses-as-headings, combine Discussion+Conclusion into one chapter
- Real page-number footer + APA table CSS + model-diagram image in export

Co-Authored-By: Claude Opus 4.8 <noreply@anthropic.com>
</commit_message>
<xml_diff>
--- a/engine/examples/custom-reference.docx
+++ b/engine/examples/custom-reference.docx
@@ -73,6 +73,7 @@
       </w:r>
     </w:p>
     <w:sectPr>
+      <w:footerReference w:type="default" r:id="rId9"/>
       <w:pgSz w:w="12240" w:h="15840"/>
       <w:pgMar w:top="1440" w:right="1440" w:bottom="1440" w:left="1440" w:header="720" w:footer="720" w:gutter="0"/>
       <w:cols w:space="720"/>
@@ -80,6 +81,27 @@
     </w:sectPr>
   </w:body>
 </w:document>
+</file>
+
+<file path=word/footer1.xml><?xml version="1.0" encoding="utf-8"?>
+<w:ftr xmlns:m="http://schemas.openxmlformats.org/officeDocument/2006/math" xmlns:mc="http://schemas.openxmlformats.org/markup-compatibility/2006" xmlns:mo="http://schemas.microsoft.com/office/mac/office/2008/main" xmlns:mv="urn:schemas-microsoft-com:mac:vml" xmlns:o="urn:schemas-microsoft-com:office:office" xmlns:r="http://schemas.openxmlformats.org/officeDocument/2006/relationships" xmlns:v="urn:schemas-microsoft-com:vml" xmlns:w10="urn:schemas-microsoft-com:office:word" xmlns:w14="http://schemas.microsoft.com/office/word/2010/wordml" xmlns:w="http://schemas.openxmlformats.org/wordprocessingml/2006/main" xmlns:wne="http://schemas.microsoft.com/office/word/2006/wordml" xmlns:wp14="http://schemas.microsoft.com/office/word/2010/wordprocessingDrawing" xmlns:wp="http://schemas.openxmlformats.org/drawingml/2006/wordprocessingDrawing" xmlns:wpc="http://schemas.microsoft.com/office/word/2010/wordprocessingCanvas" xmlns:wpg="http://schemas.microsoft.com/office/word/2010/wordprocessingGroup" xmlns:wpi="http://schemas.microsoft.com/office/word/2010/wordprocessingInk" xmlns:wps="http://schemas.microsoft.com/office/word/2010/wordprocessingShape" mc:Ignorable="w14 wp14">
+  <w:p>
+    <w:pPr>
+      <w:pStyle w:val="Footer"/>
+      <w:jc w:val="center"/>
+    </w:pPr>
+    <w:r>
+      <w:rPr>
+        <w:sz w:val="20"/>
+      </w:rPr>
+      <w:fldChar w:fldCharType="begin"/>
+      <w:instrText xml:space="preserve">PAGE</w:instrText>
+      <w:fldChar w:fldCharType="separate"/>
+      <w:t>1</w:t>
+      <w:fldChar w:fldCharType="end"/>
+    </w:r>
+  </w:p>
+</w:ftr>
 </file>
 
 <file path=word/numbering.xml><?xml version="1.0" encoding="utf-8"?>

</xml_diff>

<commit_message>
wip: continuous-writing pivot, editor extensions, auto-thesis surfaces
Checkpoint of in-flight work before the five-chapter thesis collapse.

Covers the per-module chapter composition pivot (MODULE_CHAPTERS and the
M5 roadmap split), the m5 editor router and its schema, the TipTap editor
extensions (citation highlight, DT placeholder, mermaid block), the auto
thesis run/launcher surfaces, the quick-actions menu, and two migrations.

Co-Authored-By: Claude Opus 4.8 <noreply@anthropic.com>
</commit_message>
<xml_diff>
--- a/engine/examples/custom-reference.docx
+++ b/engine/examples/custom-reference.docx
@@ -73,7 +73,6 @@
       </w:r>
     </w:p>
     <w:sectPr>
-      <w:footerReference w:type="default" r:id="rId9"/>
       <w:pgSz w:w="12240" w:h="15840"/>
       <w:pgMar w:top="1440" w:right="1440" w:bottom="1440" w:left="1440" w:header="720" w:footer="720" w:gutter="0"/>
       <w:cols w:space="720"/>
@@ -81,27 +80,6 @@
     </w:sectPr>
   </w:body>
 </w:document>
-</file>
-
-<file path=word/footer1.xml><?xml version="1.0" encoding="utf-8"?>
-<w:ftr xmlns:m="http://schemas.openxmlformats.org/officeDocument/2006/math" xmlns:mc="http://schemas.openxmlformats.org/markup-compatibility/2006" xmlns:mo="http://schemas.microsoft.com/office/mac/office/2008/main" xmlns:mv="urn:schemas-microsoft-com:mac:vml" xmlns:o="urn:schemas-microsoft-com:office:office" xmlns:r="http://schemas.openxmlformats.org/officeDocument/2006/relationships" xmlns:v="urn:schemas-microsoft-com:vml" xmlns:w10="urn:schemas-microsoft-com:office:word" xmlns:w14="http://schemas.microsoft.com/office/word/2010/wordml" xmlns:w="http://schemas.openxmlformats.org/wordprocessingml/2006/main" xmlns:wne="http://schemas.microsoft.com/office/word/2006/wordml" xmlns:wp14="http://schemas.microsoft.com/office/word/2010/wordprocessingDrawing" xmlns:wp="http://schemas.openxmlformats.org/drawingml/2006/wordprocessingDrawing" xmlns:wpc="http://schemas.microsoft.com/office/word/2010/wordprocessingCanvas" xmlns:wpg="http://schemas.microsoft.com/office/word/2010/wordprocessingGroup" xmlns:wpi="http://schemas.microsoft.com/office/word/2010/wordprocessingInk" xmlns:wps="http://schemas.microsoft.com/office/word/2010/wordprocessingShape" mc:Ignorable="w14 wp14">
-  <w:p>
-    <w:pPr>
-      <w:pStyle w:val="Footer"/>
-      <w:jc w:val="center"/>
-    </w:pPr>
-    <w:r>
-      <w:rPr>
-        <w:sz w:val="20"/>
-      </w:rPr>
-      <w:fldChar w:fldCharType="begin"/>
-      <w:instrText xml:space="preserve">PAGE</w:instrText>
-      <w:fldChar w:fldCharType="separate"/>
-      <w:t>1</w:t>
-      <w:fldChar w:fldCharType="end"/>
-    </w:r>
-  </w:p>
-</w:ftr>
 </file>
 
 <file path=word/numbering.xml><?xml version="1.0" encoding="utf-8"?>
@@ -468,13 +446,14 @@
     <w:qFormat/>
     <w:rsid w:val="00FC693F"/>
     <w:pPr>
-      <w:spacing w:line="480" w:lineRule="auto" w:before="0" w:after="0"/>
+      <w:spacing w:line="300" w:lineRule="auto" w:before="0" w:after="0"/>
       <w:ind w:firstLine="720"/>
+      <w:jc w:val="both"/>
     </w:pPr>
     <w:rPr>
       <w:rFonts w:ascii="Times New Roman" w:hAnsi="Times New Roman"/>
       <w:color w:val="000000"/>
-      <w:sz w:val="24"/>
+      <w:sz w:val="26"/>
     </w:rPr>
   </w:style>
   <w:style w:type="paragraph" w:styleId="Header">
@@ -533,7 +512,7 @@
       <w:keepNext/>
       <w:keepLines/>
       <w:pageBreakBefore w:val="0"/>
-      <w:spacing w:before="480" w:after="240" w:line="480" w:lineRule="auto"/>
+      <w:spacing w:before="480" w:after="240" w:line="300" w:lineRule="auto"/>
       <w:ind w:firstLine="0"/>
       <w:jc w:val="center"/>
       <w:outlineLvl w:val="0"/>
@@ -543,7 +522,7 @@
       <w:b/>
       <w:bCs/>
       <w:color w:val="000000"/>
-      <w:sz w:val="28"/>
+      <w:sz w:val="32"/>
       <w:szCs w:val="28"/>
     </w:rPr>
   </w:style>
@@ -559,7 +538,7 @@
     <w:pPr>
       <w:keepNext/>
       <w:keepLines/>
-      <w:spacing w:before="360" w:after="120" w:line="480" w:lineRule="auto"/>
+      <w:spacing w:before="360" w:after="120" w:line="300" w:lineRule="auto"/>
       <w:ind w:firstLine="0"/>
       <w:jc w:val="left"/>
       <w:outlineLvl w:val="1"/>
@@ -569,7 +548,7 @@
       <w:b/>
       <w:bCs/>
       <w:color w:val="000000"/>
-      <w:sz w:val="24"/>
+      <w:sz w:val="28"/>
       <w:szCs w:val="26"/>
     </w:rPr>
   </w:style>
@@ -585,7 +564,7 @@
     <w:pPr>
       <w:keepNext/>
       <w:keepLines/>
-      <w:spacing w:before="240" w:after="120" w:line="480" w:lineRule="auto"/>
+      <w:spacing w:before="240" w:after="120" w:line="300" w:lineRule="auto"/>
       <w:ind w:firstLine="0"/>
       <w:jc w:val="left"/>
       <w:outlineLvl w:val="2"/>
@@ -596,7 +575,7 @@
       <w:bCs/>
       <w:i/>
       <w:color w:val="000000"/>
-      <w:sz w:val="24"/>
+      <w:sz w:val="26"/>
     </w:rPr>
   </w:style>
   <w:style w:type="paragraph" w:styleId="Heading4">
@@ -830,7 +809,7 @@
       <w:pBdr>
         <w:bottom w:val="single" w:sz="8" w:space="4" w:color="4F81BD" w:themeColor="accent1"/>
       </w:pBdr>
-      <w:spacing w:after="240" w:line="480" w:lineRule="auto" w:before="0"/>
+      <w:spacing w:after="240" w:line="300" w:lineRule="auto" w:before="0"/>
       <w:ind w:firstLine="0"/>
       <w:contextualSpacing/>
       <w:jc w:val="center"/>
@@ -1018,12 +997,12 @@
       <w:numPr>
         <w:numId w:val="1"/>
       </w:numPr>
-      <w:spacing w:line="480" w:lineRule="auto" w:before="0" w:after="0"/>
+      <w:spacing w:line="300" w:lineRule="auto" w:before="0" w:after="0"/>
       <w:contextualSpacing/>
     </w:pPr>
     <w:rPr>
       <w:rFonts w:ascii="Times New Roman" w:hAnsi="Times New Roman"/>
-      <w:sz w:val="24"/>
+      <w:sz w:val="26"/>
     </w:rPr>
   </w:style>
   <w:style w:type="paragraph" w:styleId="ListBullet2">
@@ -1062,12 +1041,12 @@
       <w:numPr>
         <w:numId w:val="5"/>
       </w:numPr>
-      <w:spacing w:line="480" w:lineRule="auto" w:before="0" w:after="0"/>
+      <w:spacing w:line="300" w:lineRule="auto" w:before="0" w:after="0"/>
       <w:contextualSpacing/>
     </w:pPr>
     <w:rPr>
       <w:rFonts w:ascii="Times New Roman" w:hAnsi="Times New Roman"/>
-      <w:sz w:val="24"/>
+      <w:sz w:val="26"/>
     </w:rPr>
   </w:style>
   <w:style w:type="paragraph" w:styleId="ListNumber2">
@@ -12187,21 +12166,14 @@
   <w:style w:type="paragraph" w:customStyle="1" w:styleId="BlockText">
     <w:name w:val="Block Text"/>
     <w:pPr>
-      <w:spacing w:line="480" w:lineRule="auto"/>
+      <w:spacing w:line="300" w:lineRule="auto"/>
       <w:ind w:left="720" w:right="720" w:firstLine="0"/>
+      <w:jc w:val="both"/>
     </w:pPr>
     <w:rPr>
       <w:rFonts w:ascii="Times New Roman" w:hAnsi="Times New Roman"/>
-      <w:sz w:val="24"/>
+      <w:sz w:val="26"/>
     </w:rPr>
-  </w:style>
-  <w:style w:type="paragraph" w:styleId="Compact">
-    <w:name w:val="Compact"/>
-    <w:basedOn w:val="Normal"/>
-    <w:pPr>
-      <w:spacing w:before="0" w:after="0" w:line="240" w:lineRule="auto"/>
-      <w:ind w:left="0" w:right="0" w:firstLine="0"/>
-    </w:pPr>
   </w:style>
 </w:styles>
 </file>

</xml_diff>